<commit_message>
Article v113: remaining review items within the 12-page limit
Tracked changes, author Claude, on the article, supplement and cover letter.
Added: hindcast time to reach the 12 h footprint (Table IV row, V-B text, replaces
"discrete-step overshoot"); coating decomposition from t6_voda (44 uncoated worlds
-34 +/- 18%, 181 of 359 objects without coat); effort level of the reruns and a
code availability sentence (V-A).
Cut for length: duplicated gain-attribution sentences (Section I, VI), admissibility
paragraph, repeated gate-future result, single-process and grid-dominance remarks;
feature constants, concept weights, membership/execution constants, search budget
and timing-harness settings moved to the Supplementary Material.
Cover letter: date filled. Accepted text 10294 words (v112 10856, 12-page v110 10326).

Co-Authored-By: Claude Opus 5.5 <noreply@anthropic.com>
Claude-Session: https://claude.ai/code/session_01M19jxsuE4C4Pp9M3h457k6
</commit_message>
<xml_diff>
--- a/02_Article/ieee_systems/DisasterAware_CoverLetter.docx
+++ b/02_Article/ieee_systems/DisasterAware_CoverLetter.docx
@@ -7,7 +7,20 @@
         <w:spacing w:after="300"/>
       </w:pPr>
       <w:r>
-        <w:t>[Date]</w:t>
+        <w:t xml:space="preserve"/>
+      </w:r>
+      <w:del w:id="970001" w:author="Claude" w:date="2026-10-29T22:00:00Z">
+        <w:r>
+          <w:delText xml:space="preserve">[Date]</w:delText>
+        </w:r>
+      </w:del>
+      <w:ins w:id="970002" w:author="Claude" w:date="2026-10-29T22:00:00Z">
+        <w:r>
+          <w:t xml:space="preserve">October 29, 2026</w:t>
+        </w:r>
+      </w:ins>
+      <w:r>
+        <w:t xml:space="preserve"/>
       </w:r>
     </w:p>
     <w:p>

</xml_diff>

<commit_message>
Article v113 clean: all tracked changes accepted
Accepted every tracked change (v112 and v113) in the article, supplement and
cover letter; title page had none. Accepted text checked against pandoc's
accept view for each file, schema validation passed, article renders in
12 pages.

Co-Authored-By: Claude Opus 5.5 <noreply@anthropic.com>
Claude-Session: https://claude.ai/code/session_01M19jxsuE4C4Pp9M3h457k6
</commit_message>
<xml_diff>
--- a/02_Article/ieee_systems/DisasterAware_CoverLetter.docx
+++ b/02_Article/ieee_systems/DisasterAware_CoverLetter.docx
@@ -9,16 +9,9 @@
       <w:r>
         <w:t xml:space="preserve"/>
       </w:r>
-      <w:del w:id="970001" w:author="Claude" w:date="2026-10-29T22:00:00Z">
-        <w:r>
-          <w:delText xml:space="preserve">[Date]</w:delText>
-        </w:r>
-      </w:del>
-      <w:ins w:id="970002" w:author="Claude" w:date="2026-10-29T22:00:00Z">
-        <w:r>
-          <w:t xml:space="preserve">October 29, 2026</w:t>
-        </w:r>
-      </w:ins>
+      <w:r>
+        <w:t xml:space="preserve">October 29, 2026</w:t>
+      </w:r>
       <w:r>
         <w:t xml:space="preserve"/>
       </w:r>
@@ -91,16 +84,9 @@
       <w:r>
         <w:t xml:space="preserve">On 150 paired synthetic incidents, VODA lowers burned area by 61%, affected population by 80% and priced response by 46% against the closed layer, and raises the share of extinguished incidents from 52% to 91%. A random proposer behind the same pre-selection and gates reaches three quarters of this gain, </w:t>
       </w:r>
-      <w:del w:id="920048" w:author="Claude" w:date="2026-10-29T18:30:00Z">
-        <w:r>
-          <w:delText xml:space="preserve">so the result rests on the architecture rather than on a particular language model.</w:delText>
-        </w:r>
-      </w:del>
-      <w:ins w:id="920049" w:author="Claude" w:date="2026-10-29T18:30:00Z">
-        <w:r>
-          <w:t xml:space="preserve">so the gain rests on the composed vocabulary and the forecast-guided search rather than on the particular proposer.</w:t>
-        </w:r>
-      </w:ins>
+      <w:r>
+        <w:t xml:space="preserve">so the gain rests on the composed vocabulary and the forecast-guided search rather than on the particular proposer.</w:t>
+      </w:r>
       <w:r>
         <w:t xml:space="preserve"> The admitted interventions recur across incidents and, recorded as rules, transfer to unseen ones, while continued generation adds further gain under new conditions. The hazard model is assessed separately by blind hindcast of four documented fires, and the decision core decides in under one second between model calls, with a cost that grows slowly with the number of regional agents.</w:t>
       </w:r>

</xml_diff>

<commit_message>
Article: admission described as the gate chain over every candidate, no pre-selection term
The gates are applied to all candidates of a call (G1 to G4 without simulation, G5 forecast on
the first future, second future for the best three, G5 to G8 completed by the best survivor);
at most one object per call. Gate statistics moved to the gates: 105 857 candidates, 78 662
rejected at G1 to G4, 514 empty calls, 359 admitted. Independent-future test described as
selection on 101/202 and final test on 303/404. Abstract, intro, contributions, IV-D,
Algorithm 1, V-A, V-C, V-D, V-E, cover letter and Fig. 4 text in the drawio updated.
Based on v113 clean; tracked changes, author Claude.

Co-Authored-By: Claude Fable 5.1 <noreply@anthropic.com>
Claude-Session: https://claude.ai/code/session_01SpJY1eTMuWxnLRbAr2HJ4M
</commit_message>
<xml_diff>
--- a/02_Article/ieee_systems/DisasterAware_CoverLetter.docx
+++ b/02_Article/ieee_systems/DisasterAware_CoverLetter.docx
@@ -61,20 +61,18 @@
         <w:jc w:val="both"/>
       </w:pPr>
       <w:r>
-        <w:t>Most decision support systems decide within a closed decision space, a set of rules or tactics fixed before the incident. The manuscript presents the Verified Open Decision Architect</w:t>
-      </w:r>
-      <w:r>
-        <w:t>ure (VODA), which extends this space by verified composition. New interventions are composed from a fixed set of executable physical effects, and a proposal enters the rule base only when the hazard model, not the proposer, forecasts a gain. A simulation c</w:t>
-      </w:r>
-      <w:r>
-        <w:t>ore holds the hazard state, and a decision core reads it through confidence-rated observations. The decision core combines a self-tuning sparse Takagi-Sugeno rule base with an open layer in which a pretrained language model proposes rules and composed inte</w:t>
-      </w:r>
-      <w:r>
-        <w:t>rventions that are pre-selected on forecasts and checked by a chain of gates</w:t>
-      </w:r>
-      <w:r>
-        <w:t>.</w:t>
-      </w:r>
+        <w:t xml:space="preserve">Most decision support systems decide within a closed decision space, a set of rules or tactics fixed before the incident. The manuscript presents the Verified Open Decision Architecture (VODA), which extends this space by verified composition. New interventions are composed from a fixed set of executable physical effects, and a proposal enters the rule base only when the hazard model, not the proposer, forecasts a gain. A simulation core holds the hazard state, and a decision core reads it through confidence-rated observations. The decision core combines a self-tuning sparse Takagi-Sugeno rule base with an open layer in which a pretrained language model </w:t>
+      </w:r>
+      <w:del w:id="920039" w:author="Claude" w:date="2026-10-29T18:30:00Z">
+        <w:r>
+          <w:delText xml:space="preserve">proposes rules and composed interventions that are pre-selected on forecasts and checked by a chain of gates.</w:delText>
+        </w:r>
+      </w:del>
+      <w:ins w:id="920040" w:author="Claude" w:date="2026-10-29T18:30:00Z">
+        <w:r>
+          <w:t xml:space="preserve">proposes rules and composed interventions, and a chain of gates on hazard forecasts admits at most one object per call.</w:t>
+        </w:r>
+      </w:ins>
     </w:p>
     <w:p>
       <w:pPr>
@@ -82,13 +80,20 @@
         <w:jc w:val="both"/>
       </w:pPr>
       <w:r>
-        <w:t xml:space="preserve">On 150 paired synthetic incidents, VODA lowers burned area by 61%, affected population by 80% and priced response by 46% against the closed layer, and raises the share of extinguished incidents from 52% to 91%. A random proposer behind the same pre-selection and gates reaches three quarters of this gain, </w:t>
-      </w:r>
-      <w:r>
-        <w:t xml:space="preserve">so the gain rests on the composed vocabulary and the forecast-guided search rather than on the particular proposer.</w:t>
-      </w:r>
-      <w:r>
-        <w:t xml:space="preserve"> The admitted interventions recur across incidents and, recorded as rules, transfer to unseen ones, while continued generation adds further gain under new conditions. The hazard model is assessed separately by blind hindcast of four documented fires, and the decision core decides in under one second between model calls, with a cost that grows slowly with the number of regional agents.</w:t>
+        <w:t xml:space="preserve">On 150 paired synthetic incidents, VODA lowers burned area by 61%, affected population by 80% and priced response by 46% against the closed layer, and raises the share of extinguished incidents from 52% to 91%. </w:t>
+      </w:r>
+      <w:del w:id="920041" w:author="Claude" w:date="2026-10-29T18:30:00Z">
+        <w:r>
+          <w:delText xml:space="preserve">A random proposer behind the same pre-selection and gates reaches</w:delText>
+        </w:r>
+      </w:del>
+      <w:ins w:id="920042" w:author="Claude" w:date="2026-10-29T18:30:00Z">
+        <w:r>
+          <w:t xml:space="preserve">A random proposer behind the same gates reaches</w:t>
+        </w:r>
+      </w:ins>
+      <w:r>
+        <w:t xml:space="preserve"> three quarters of this gain, so the gain rests on the composed vocabulary and the forecast-guided search rather than on the particular proposer. The admitted interventions recur across incidents and, recorded as rules, transfer to unseen ones, while continued generation adds further gain under new conditions. The hazard model is assessed separately by blind hindcast of four documented fires, and the decision core decides in under one second between model calls, with a cost that grows slowly with the number of regional agents.</w:t>
       </w:r>
     </w:p>
     <w:p>

</xml_diff>

<commit_message>
Fig. 4 re-exported from the drawio; HAVELSAN removed from title page and cover letter
Fig. 4 image replaced in the article (1904 x 2104, same export pipeline). Title page: METU
affiliation only, conflict statement without employer; cover letter: plain no-competing-interests
sentence. The biography at the end of the article is unchanged.

Co-Authored-By: Claude Fable 5.1 <noreply@anthropic.com>
Claude-Session: https://claude.ai/code/session_01SpJY1eTMuWxnLRbAr2HJ4M
</commit_message>
<xml_diff>
--- a/02_Article/ieee_systems/DisasterAware_CoverLetter.docx
+++ b/02_Article/ieee_systems/DisasterAware_CoverLetter.docx
@@ -120,19 +120,20 @@
         <w:jc w:val="both"/>
       </w:pPr>
       <w:r>
-        <w:t xml:space="preserve">The manuscript is original, has not been published previously, and is not under consideration elsewhere. All authors have read and approved the submitted version. Part of the material derives from the doctoral research of the corresponding author at </w:t>
-      </w:r>
-      <w:r>
-        <w:t xml:space="preserve">Middle East Technical University. The corresponding author is employed by HAVELSAN A.Ş., which had no role in the design, execution, analysis, or reporting of the study, and the authors declare no other competing interests. </w:t>
-      </w:r>
-      <w:r>
-        <w:t xml:space="preserve">A supplementary file lists the </w:t>
-      </w:r>
-      <w:r>
-        <w:t>hand-written rule base used as a closed referenc</w:t>
-      </w:r>
-      <w:r>
-        <w:t>e.</w:t>
+        <w:t xml:space="preserve">The manuscript is original, has not been published previously, and is not under consideration elsewhere. All authors have read and approved the submitted version. Part of the material derives from the doctoral research of the corresponding author at Middle East Technical University. </w:t>
+      </w:r>
+      <w:del w:id="920001" w:author="Claude" w:date="2026-10-29T18:30:00Z">
+        <w:r>
+          <w:delText xml:space="preserve">The corresponding author is employed by HAVELSAN A.Ş., which had no role in the design, execution, analysis, or reporting of the study, and the authors declare no other competing interests.</w:delText>
+        </w:r>
+      </w:del>
+      <w:ins w:id="920002" w:author="Claude" w:date="2026-10-29T18:30:00Z">
+        <w:r>
+          <w:t xml:space="preserve">The authors declare no competing interests.</w:t>
+        </w:r>
+      </w:ins>
+      <w:r>
+        <w:t xml:space="preserve"> A supplementary file lists the hand-written rule base used as a closed reference.</w:t>
       </w:r>
     </w:p>
     <w:p>

</xml_diff>

<commit_message>
Article: K11 hand-written effect doctrine merged into Test 5; question-inviting details removed; fourth-review text items
K11: Table VII row (−9 ± 6% area, −2 ± 5% cost), V-A control description, V-D and VI
interpretation, abstract and cover letter; comparison family 30. Removed: first-order-at-2-min
sentence, coating reach sentence, random-proposer sampling details, permutation seed,
Table IV footprint-time row and the speed clause, LB coefficient remark, 3.4 divisor.
Added: random control named as random search with simulation-based selection, G5/G6 same
test on two futures, tactic recurrence threshold, rule names one to three concepts,
references 19, 20, 26 (publisher, French 2009) and 42 (et al.), cover letter supplement
description and SoS wording. Tracked changes, author Claude.

Co-Authored-By: Claude Fable 5.1 <noreply@anthropic.com>
Claude-Session: https://claude.ai/code/session_01SpJY1eTMuWxnLRbAr2HJ4M
</commit_message>
<xml_diff>
--- a/02_Article/ieee_systems/DisasterAware_CoverLetter.docx
+++ b/02_Article/ieee_systems/DisasterAware_CoverLetter.docx
@@ -127,7 +127,29 @@
         <w:rPr>
           <w:lang w:val="en-US"/>
         </w:rPr>
-        <w:t>On 150 paired synthetic incidents, VODA lowers burned area by 61%, affected population by 80% and priced response by 46% against the closed layer, and raises the share of extinguished incidents from 52% to 91%. A random proposer behind the same gates reaches three quarters of this gain, so the gain rests on the composed vocabulary and the forecast-guided search rather than on the particular proposer. The admitted interventions recur across incidents and, recorded as rules, transfer to unseen ones, while continued generation adds further gain under new conditions. The hazard model is assessed separately by blind hindcast of four documented fires, and the decision core decides in under one second between model calls, with a cost that grows slowly with the number of regional agents.</w:t>
+        <w:t xml:space="preserve">On 150 paired synthetic incidents, VODA lowers burned area by 61%, affected population by 80% and priced response by 46% against the closed layer, and raises the share of extinguished incidents from 52% to 91%. </w:t>
+      </w:r>
+      <w:del w:id="950072" w:author="Claude" w:date="2026-10-29T18:30:00Z">
+        <w:r>
+          <w:rPr>
+            <w:lang w:val="en-US"/>
+          </w:rPr>
+          <w:delText xml:space="preserve">A random proposer behind the same gates reaches three quarters of this gain, so the gain rests on the composed vocabulary and the forecast-guided search rather than on the particular proposer.</w:delText>
+        </w:r>
+      </w:del>
+      <w:ins w:id="950073" w:author="Claude" w:date="2026-10-29T18:30:00Z">
+        <w:r>
+          <w:rPr>
+            <w:lang w:val="en-US"/>
+          </w:rPr>
+          <w:t xml:space="preserve">A random proposer behind the same gates reaches three quarters of this gain and a hand-written doctrine over the same effects gains little, so the gain rests on the gated search rather than on the particular proposer or on access to the effects.</w:t>
+        </w:r>
+      </w:ins>
+      <w:r>
+        <w:rPr>
+          <w:lang w:val="en-US"/>
+        </w:rPr>
+        <w:t xml:space="preserve"> The admitted interventions recur across incidents and, recorded as rules, transfer to unseen ones, while continued generation adds further gain under new conditions. The hazard model is assessed separately by blind hindcast of four documented fires, and the decision core decides in under one second between model calls, with a cost that grows slowly with the number of regional agents.</w:t>
       </w:r>
     </w:p>
     <w:p>
@@ -138,11 +160,27 @@
           <w:lang w:val="en-US"/>
         </w:rPr>
       </w:pPr>
-      <w:r>
-        <w:rPr>
-          <w:lang w:val="en-US"/>
-        </w:rPr>
-        <w:t>The work fits the scope of the IEEE Systems Journal as a system-of-systems contribution. Wildfire response joins a hazard model, regional decision agents, a shared resource pool and a human operator. The manuscript contributes the architecture that couples these parts and keeps the admission of new interventions under the control of the hazard model, and evaluates it as one system rather than as isolated algorithms.</w:t>
+      <w:del w:id="950068" w:author="Claude" w:date="2026-10-29T18:30:00Z">
+        <w:r>
+          <w:rPr>
+            <w:lang w:val="en-US"/>
+          </w:rPr>
+          <w:delText xml:space="preserve">The work fits the scope of the IEEE Systems Journal as a system-of-systems contribution.</w:delText>
+        </w:r>
+      </w:del>
+      <w:ins w:id="950069" w:author="Claude" w:date="2026-10-29T18:30:00Z">
+        <w:r>
+          <w:rPr>
+            <w:lang w:val="en-US"/>
+          </w:rPr>
+          <w:t xml:space="preserve">The work fits the scope of the IEEE Systems Journal as an architecture for a system of systems.</w:t>
+        </w:r>
+      </w:ins>
+      <w:r>
+        <w:rPr>
+          <w:lang w:val="en-US"/>
+        </w:rPr>
+        <w:t xml:space="preserve"> Wildfire response joins a hazard model, regional decision agents, a shared resource pool and a human operator. The manuscript contributes the architecture that couples these parts and keeps the admission of new interventions under the control of the hazard model, and evaluates it as one system rather than as isolated algorithms.</w:t>
       </w:r>
     </w:p>
     <w:p>
@@ -157,8 +195,24 @@
         <w:rPr>
           <w:lang w:val="en-US"/>
         </w:rPr>
-        <w:t>The manuscript is original, has not been published previously, and is not under consideration elsewhere. All authors have read and approved the submitted version. Part of the material derives from the doctoral research of the corresponding author at Middle East Technical University. The authors declare no competing interests. A supplementary file lists the hand-written rule base used as a closed reference.</w:t>
-      </w:r>
+        <w:t xml:space="preserve">The manuscript is original, has not been published previously, and is not under consideration elsewhere. All authors have read and approved the submitted version. Part of the material derives from the doctoral research of the corresponding author at Middle East Technical University. The authors declare no competing interests. </w:t>
+      </w:r>
+      <w:del w:id="950070" w:author="Claude" w:date="2026-10-29T18:30:00Z">
+        <w:r>
+          <w:rPr>
+            <w:lang w:val="en-US"/>
+          </w:rPr>
+          <w:delText xml:space="preserve">A supplementary file lists the hand-written rule base used as a closed reference.</w:delText>
+        </w:r>
+      </w:del>
+      <w:ins w:id="950071" w:author="Claude" w:date="2026-10-29T18:30:00Z">
+        <w:r>
+          <w:rPr>
+            <w:lang w:val="en-US"/>
+          </w:rPr>
+          <w:t xml:space="preserve">A supplementary file gives the hand-written rule base, the extraction constants and the proposer prompt.</w:t>
+        </w:r>
+      </w:ins>
     </w:p>
     <w:p>
       <w:pPr>

</xml_diff>

<commit_message>
Fifth review: inconsistencies fixed, prompt replaced by a template, question-inviting details removed; all changes accepted
Eq. (16) J_burn corrected to x_b/(1+x_b) with x_b = N_burned/(rho N_burnable) as implemented;
transfer tactics described as archetypes of the 75 derivation worlds; [48] and [49] cited in
IV-A; final-test counts stated per call; Fig. 6 alt-text note, received date, 240 s timeout,
closed-domain sentence, system-of-systems index term and abstract sentence removed; biography
degree wording; exploratory label for secondary rows; closed-layer forecast use stated;
receding-horizon positioning sentence. Supplement: recorded prompt replaced by a template.
Cover letter: journal-fit sentence. No tracked changes remain in the four documents.

Co-Authored-By: Claude Fable 5.1 <noreply@anthropic.com>
Claude-Session: https://claude.ai/code/session_01SpJY1eTMuWxnLRbAr2HJ4M
</commit_message>
<xml_diff>
--- a/02_Article/ieee_systems/DisasterAware_CoverLetter.docx
+++ b/02_Article/ieee_systems/DisasterAware_CoverLetter.docx
@@ -133,7 +133,7 @@
         <w:rPr>
           <w:lang w:val="en-US"/>
         </w:rPr>
-        <w:t>A random proposer behind the same gates reaches three quarters of this gain and a hand-written doctrine over the same effects gains little, so the gain rests on the gated search rather than on the particular proposer or on access to the effects.</w:t>
+        <w:t xml:space="preserve">A random proposer behind the same gates reaches three quarters of this gain and a hand-written doctrine over the same effects gains little, so the gain rests on the gated search rather than on the particular proposer or on access to the effects.</w:t>
       </w:r>
       <w:r>
         <w:rPr>
@@ -154,13 +154,7 @@
         <w:rPr>
           <w:lang w:val="en-US"/>
         </w:rPr>
-        <w:t>The work fits the scope of the IEEE Systems Journal as an architecture for a system of systems.</w:t>
-      </w:r>
-      <w:r>
-        <w:rPr>
-          <w:lang w:val="en-US"/>
-        </w:rPr>
-        <w:t xml:space="preserve"> Wildfire response joins a hazard model, regional decision agents, a shared resource pool and a human operator. The manuscript contributes the architecture that couples these parts and keeps the admission of new interventions under the control of the hazard model, and evaluates it as one system rather than as isolated algorithms.</w:t>
+        <w:t xml:space="preserve">The work fits the scope of the IEEE Systems Journal as a systems-level decision architecture evaluated as one system. Wildfire response joins a hazard model, regional decision agents, a shared resource pool and a human operator. The manuscript contributes the architecture that couples these parts and keeps the admission of new interventions under the control of the hazard model, and evaluates it as one system rather than as isolated algorithms.</w:t>
       </w:r>
     </w:p>
     <w:p>
@@ -181,7 +175,7 @@
         <w:rPr>
           <w:lang w:val="en-US"/>
         </w:rPr>
-        <w:t>A supplementary file gives the hand-written rule base, the extraction constants and the proposer prompt.</w:t>
+        <w:t xml:space="preserve">A supplementary file gives the hand-written rule base, the extraction constants and the proposer prompt.</w:t>
       </w:r>
     </w:p>
     <w:p>

</xml_diff>

<commit_message>
Article, supplement, cover letter, title page: Verified renamed Gated (GODA), verification caveat removed; engine thresholds and spotting constants stated; hindcast and scale positioning sentences
Co-Authored-By: Claude Fable 5.1 <noreply@anthropic.com>
Claude-Session: https://claude.ai/code/session_01SpJY1eTMuWxnLRbAr2HJ4M
</commit_message>
<xml_diff>
--- a/02_Article/ieee_systems/DisasterAware_CoverLetter.docx
+++ b/02_Article/ieee_systems/DisasterAware_CoverLetter.docx
@@ -69,21 +69,7 @@
         <w:rPr>
           <w:lang w:val="en-US"/>
         </w:rPr>
-        <w:t xml:space="preserve">The enclosed manuscript, "A Decision Support Architecture </w:t>
-      </w:r>
-      <w:proofErr w:type="gramStart"/>
-      <w:r>
-        <w:rPr>
-          <w:lang w:val="en-US"/>
-        </w:rPr>
-        <w:t>With</w:t>
-      </w:r>
-      <w:proofErr w:type="gramEnd"/>
-      <w:r>
-        <w:rPr>
-          <w:lang w:val="en-US"/>
-        </w:rPr>
-        <w:t xml:space="preserve"> a Verified Open Decision Space for Wildfire Response," is submitted for consideration as a regular paper in the IEEE Systems Journal.</w:t>
+        <w:t xml:space="preserve">The enclosed manuscript, "A Decision Support Architecture With a Gated Open Decision Space for Wildfire Response," is submitted for consideration as a regular paper in the IEEE Systems Journal.</w:t>
       </w:r>
     </w:p>
     <w:p>
@@ -98,21 +84,7 @@
         <w:rPr>
           <w:lang w:val="en-US"/>
         </w:rPr>
-        <w:t>Most decision support systems decide within a closed decision space, a set of rules or tactics fixed before the incident. The manuscript presents the Verified Open Decision Architecture (VODA), which extends this space by verified composition. New interventions are composed from a fixed set of executable physical effects, and a proposal enters the rule base only when the hazard model, not the proposer, forecasts a gain. A simulation core holds the hazard state, and a decision core reads it through confidence-rated observations. The decision core combines a self-tuning sparse Takagi-</w:t>
-      </w:r>
-      <w:proofErr w:type="spellStart"/>
-      <w:r>
-        <w:rPr>
-          <w:lang w:val="en-US"/>
-        </w:rPr>
-        <w:t>Sugeno</w:t>
-      </w:r>
-      <w:proofErr w:type="spellEnd"/>
-      <w:r>
-        <w:rPr>
-          <w:lang w:val="en-US"/>
-        </w:rPr>
-        <w:t xml:space="preserve"> rule base with an open layer in which a pretrained language model proposes rules and composed interventions, and a chain of gates on hazard forecasts admits at most one object per call.</w:t>
+        <w:t xml:space="preserve">Most decision support systems decide within a closed decision space, a set of rules or tactics fixed before the incident. The manuscript presents the Gated Open Decision Architecture (GODA), which extends this space by gated composition. New interventions are composed from a fixed set of executable physical effects, and a proposal enters the rule base only when the hazard model, not the proposer, forecasts a gain. A simulation core holds the hazard state, and a decision core reads it through confidence-rated observations. The decision core combines a self-tuning sparse Takagi-Sugeno rule base with an open layer in which a pretrained language model proposes rules and composed interventions, and a chain of gates on hazard forecasts admits at most one object per call.</w:t>
       </w:r>
     </w:p>
     <w:p>
@@ -127,19 +99,7 @@
         <w:rPr>
           <w:lang w:val="en-US"/>
         </w:rPr>
-        <w:t xml:space="preserve">On 150 paired synthetic incidents, VODA lowers burned area by 61%, affected population by 80% and priced response by 46% against the closed layer, and raises the share of extinguished incidents from 52% to 91%. </w:t>
-      </w:r>
-      <w:r>
-        <w:rPr>
-          <w:lang w:val="en-US"/>
-        </w:rPr>
-        <w:t xml:space="preserve">A random proposer behind the same gates reaches three quarters of this gain and a hand-written doctrine over the same effects gains little, so the gain rests on the gated search rather than on the particular proposer or on access to the effects.</w:t>
-      </w:r>
-      <w:r>
-        <w:rPr>
-          <w:lang w:val="en-US"/>
-        </w:rPr>
-        <w:t xml:space="preserve"> The admitted interventions recur across incidents and, recorded as rules, transfer to unseen ones, while continued generation adds further gain under new conditions. The hazard model is assessed separately by blind hindcast of four documented fires, and the decision core decides in under one second between model calls, with a cost that grows slowly with the number of regional agents.</w:t>
+        <w:t xml:space="preserve">On 150 paired synthetic incidents, GODA lowers burned area by 61%, affected population by 80% and priced response by 46% against the closed layer, and raises the share of extinguished incidents from 52% to 91%. A random proposer behind the same gates reaches three quarters of this gain and a hand-written doctrine over the same effects gains little, so the gain rests on the gated search rather than on the particular proposer or on access to the effects. The admitted interventions recur across incidents and, recorded as rules, transfer to unseen ones, while continued generation adds further gain under new conditions. The hazard model is assessed separately by blind hindcast of four documented fires, and the decision core decides in under one second between model calls, with a cost that grows slowly with the number of regional agents.</w:t>
       </w:r>
     </w:p>
     <w:p>

</xml_diff>

<commit_message>
Article: tuning protocol and rule-base reset stated, budget named in abstract, coating sentence qualified, harness settings noted, paragraph housekeeping; cover letter terms harmonized
Co-Authored-By: Claude Fable 5.1 <noreply@anthropic.com>
Claude-Session: https://claude.ai/code/session_01SpJY1eTMuWxnLRbAr2HJ4M
</commit_message>
<xml_diff>
--- a/02_Article/ieee_systems/DisasterAware_CoverLetter.docx
+++ b/02_Article/ieee_systems/DisasterAware_CoverLetter.docx
@@ -84,7 +84,7 @@
         <w:rPr>
           <w:lang w:val="en-US"/>
         </w:rPr>
-        <w:t xml:space="preserve">Most decision support systems decide within a closed decision space, a set of rules or tactics fixed before the incident. The manuscript presents the Gated Open Decision Architecture (GODA), which extends this space by gated composition. New interventions are composed from a fixed set of executable physical effects, and a proposal enters the rule base only when the hazard model, not the proposer, forecasts a gain. A simulation core holds the hazard state, and a decision core reads it through confidence-rated observations. The decision core combines a self-tuning sparse Takagi-Sugeno rule base with an open layer in which a pretrained language model proposes rules and composed interventions, and a chain of gates on hazard forecasts admits at most one object per call.</w:t>
+        <w:t xml:space="preserve">Most decision support systems decide within a closed decision space, a set of rules or tactics fixed before the incident. The manuscript presents the Gated Open Decision Architecture (GODA), which extends this space by gated composition. New interventions are composed from a fixed set of executable physical effects, and a proposal enters the rule base only when the hazard model, not the proposer, forecasts a gain. A simulation core holds the hazard state, and a decision core reads it through confidence-rated observations. The decision core combines a self-tuning Takagi-Sugeno rule base with an open layer in which a pretrained language model proposes rules and composed interventions, and a chain of gates on hazard forecasts admits at most one object per call.</w:t>
       </w:r>
     </w:p>
     <w:p>
@@ -99,7 +99,7 @@
         <w:rPr>
           <w:lang w:val="en-US"/>
         </w:rPr>
-        <w:t xml:space="preserve">On 150 paired synthetic incidents, GODA lowers burned area by 61%, affected population by 80% and priced response by 46% against the closed layer, and raises the share of extinguished incidents from 52% to 91%. Behind the same gates, a search over the closed vocabulary reaches two thirds of this gain and a random proposer over the composed grammar three quarters, while a hand-written doctrine over the same effects gains little, so the gain rests first on the forecast-guided search and then on the compositions it finds from good seeds. The admitted interventions recur across incidents and, recorded as rules, transfer to unseen ones, while continued generation adds further gain under new conditions. The hazard model is assessed separately by hindcast of four documented fires, and the decision core decides in under one second between model calls, with a cost that grows slowly with the number of regional agents.</w:t>
+        <w:t xml:space="preserve">On 150 paired synthetic incidents, GODA lowers burned area by 61%, affected population by 80% and response cost by 46% against the closed layer, and raises the share of extinguished incidents from 52% to 91%. Behind the same gates, a search over the closed vocabulary reaches two thirds of this gain and a random proposer over the composed grammar three quarters, while a hand-written doctrine over the same effects gains little, so the gain rests first on the forecast-guided search and then on the compositions it finds from good seeds. The admitted interventions recur across incidents and, recorded as rules, transfer to unseen ones, while continued generation adds further gain under new conditions. The hazard model is assessed separately by hindcast of four documented fires, and the decision core decides in under one second between model calls, with a cost that grows slowly with the number of regional agents.</w:t>
       </w:r>
     </w:p>
     <w:p>

</xml_diff>

<commit_message>
Supplement: simulation core maps and constants (spread rate, combustion, suppression removal, intensity proxy, spotting); article: availability statement, pointer to the maps, domain-boundary sentence, scope sentence on the architecture, terms paragraph, V-C paragraph split; cover letter scope; K4e equal-area ellipse reference script
Co-Authored-By: Claude Fable 5.1 <noreply@anthropic.com>
Claude-Session: https://claude.ai/code/session_01SpJY1eTMuWxnLRbAr2HJ4M
</commit_message>
<xml_diff>
--- a/02_Article/ieee_systems/DisasterAware_CoverLetter.docx
+++ b/02_Article/ieee_systems/DisasterAware_CoverLetter.docx
@@ -114,7 +114,7 @@
         <w:rPr>
           <w:lang w:val="en-US"/>
         </w:rPr>
-        <w:t xml:space="preserve">The work fits the scope of the IEEE Systems Journal as a systems-level decision architecture evaluated as one system. Wildfire response joins a hazard model, regional decision agents, a shared resource pool and a human operator. The manuscript contributes the architecture that couples these parts and keeps the admission of new interventions under the control of the hazard model, and evaluates it as one system rather than as isolated algorithms.</w:t>
+        <w:t xml:space="preserve">The work fits the scope of the IEEE Systems Journal as a systems-level decision architecture evaluated as one system. Wildfire response joins a hazard model, regional decision agents, a shared resource pool and a human operator. The manuscript contributes the architecture that couples these parts and keeps the admission of new interventions under the control of the hazard model, and evaluates it in simulation as one system rather than as isolated algorithms; distributed operation of the agents is outside the scope of this study.</w:t>
       </w:r>
     </w:p>
     <w:p>
@@ -129,13 +129,7 @@
         <w:rPr>
           <w:lang w:val="en-US"/>
         </w:rPr>
-        <w:t xml:space="preserve">The manuscript is original, has not been published previously, and is not under consideration elsewhere. All authors have read and approved the submitted version. Part of the material derives from the doctoral research of the corresponding author at Middle East Technical University. The authors declare no competing interests. </w:t>
-      </w:r>
-      <w:r>
-        <w:rPr>
-          <w:lang w:val="en-US"/>
-        </w:rPr>
-        <w:t xml:space="preserve">A supplementary file gives the hand-written rule base, the extraction constants and the proposer prompt.</w:t>
+        <w:t xml:space="preserve">The manuscript is original, has not been published previously, and is not under consideration elsewhere. All authors have read and approved the submitted version. Part of the material derives from the doctoral research of the corresponding author at Middle East Technical University. The authors declare no competing interests. A supplementary file gives the hand-written rule base, the extraction constants and the proposer prompt.</w:t>
       </w:r>
     </w:p>
     <w:p>
@@ -177,16 +171,8 @@
         <w:rPr>
           <w:lang w:val="en-US"/>
         </w:rPr>
-        <w:t xml:space="preserve">Çağlar </w:t>
-      </w:r>
-      <w:proofErr w:type="spellStart"/>
-      <w:r>
-        <w:rPr>
-          <w:lang w:val="en-US"/>
-        </w:rPr>
-        <w:t>Akman</w:t>
-      </w:r>
-      <w:proofErr w:type="spellEnd"/>
+        <w:t xml:space="preserve">Çağlar Akman</w:t>
+      </w:r>
     </w:p>
     <w:p>
       <w:pPr>
@@ -211,16 +197,8 @@
         <w:rPr>
           <w:lang w:val="en-US"/>
         </w:rPr>
-        <w:t xml:space="preserve">Department of Electrical and Electronics Engineering, Middle East Technical University, 06800 Ankara, </w:t>
-      </w:r>
-      <w:proofErr w:type="spellStart"/>
-      <w:r>
-        <w:rPr>
-          <w:lang w:val="en-US"/>
-        </w:rPr>
-        <w:t>Türkiye</w:t>
-      </w:r>
-      <w:proofErr w:type="spellEnd"/>
+        <w:t xml:space="preserve">Department of Electrical and Electronics Engineering, Middle East Technical University, 06800 Ankara, Türkiye</w:t>
+      </w:r>
     </w:p>
     <w:p>
       <w:pPr>
@@ -245,16 +223,8 @@
         <w:rPr>
           <w:lang w:val="en-US"/>
         </w:rPr>
-        <w:t xml:space="preserve">On behalf of the co-author, Kemal </w:t>
-      </w:r>
-      <w:proofErr w:type="spellStart"/>
-      <w:r>
-        <w:rPr>
-          <w:lang w:val="en-US"/>
-        </w:rPr>
-        <w:t>Leblebicioğlu</w:t>
-      </w:r>
-      <w:proofErr w:type="spellEnd"/>
+        <w:t xml:space="preserve">On behalf of the co-author, Kemal Leblebicioğlu</w:t>
+      </w:r>
     </w:p>
     <w:p>
       <w:pPr>

</xml_diff>

<commit_message>
Abstract 250 words; Holm family 41 with p values for the five new rows; budget sentence; VI wording; acknowledgment of AI assistance; supplement subscripts; cover letter updated (domain, robustness, supplement contents, repository, date)
Co-Authored-By: Claude Fable 5.1 <noreply@anthropic.com>
Claude-Session: https://claude.ai/code/session_01SpJY1eTMuWxnLRbAr2HJ4M
</commit_message>
<xml_diff>
--- a/02_Article/ieee_systems/DisasterAware_CoverLetter.docx
+++ b/02_Article/ieee_systems/DisasterAware_CoverLetter.docx
@@ -13,7 +13,7 @@
         <w:rPr>
           <w:lang w:val="en-US"/>
         </w:rPr>
-        <w:t>October 29, 2026</w:t>
+        <w:t xml:space="preserve">October 31, 2026</w:t>
       </w:r>
     </w:p>
     <w:p>
@@ -99,7 +99,7 @@
         <w:rPr>
           <w:lang w:val="en-US"/>
         </w:rPr>
-        <w:t xml:space="preserve">On 150 paired synthetic incidents, GODA lowers burned area by 61%, affected population by 80% and response cost by 46% against the closed layer, and raises the share of extinguished incidents from 52% to 91%. Behind the same gates, a search over the closed vocabulary reaches two thirds of this gain and a random proposer over the composed grammar three quarters, while a hand-written doctrine over the same effects gains little, so the gain rests first on the forecast-guided search and then on the compositions it finds from good seeds. The admitted interventions recur across incidents and, recorded as rules, transfer to unseen ones, while continued generation adds further gain under new conditions. The hazard model is assessed separately by hindcast of four documented fires, and the decision core decides in under one second between model calls, with a cost that grows slowly with the number of regional agents.</w:t>
+        <w:t xml:space="preserve">On 150 paired synthetic incidents, GODA lowers burned area by 61%, affected population by 80% and response cost by 46% against the closed layer, and raises the share of extinguished incidents from 52% to 91%; on a domain three times larger the area reduction is 57%. Behind the same gates, a search over the closed vocabulary reaches two thirds of this gain and a random proposer over the composed grammar three quarters, while a hand-written doctrine over the same effects gains little, so the gain rests first on the forecast-guided search and then on the compositions it finds from good seeds. The admitted interventions recur across incidents and, recorded as rules, transfer to unseen ones, while continued generation adds further gain under new conditions. The gain holds under single and combined model errors in the live world, under a fire state partly unseen by the planner, under four alternative cost functions and across forecast budgets, and every row of the comparison tables carries a paired test with a Holm adjustment. The hazard model is assessed separately by hindcast of four documented fires against disk and ellipse references, and the decision core decides in under one second between model calls in a harness without the model, with a cost that grows slowly with the number of regional agents.</w:t>
       </w:r>
     </w:p>
     <w:p>
@@ -129,7 +129,7 @@
         <w:rPr>
           <w:lang w:val="en-US"/>
         </w:rPr>
-        <w:t xml:space="preserve">The manuscript is original, has not been published previously, and is not under consideration elsewhere. All authors have read and approved the submitted version. Part of the material derives from the doctoral research of the corresponding author at Middle East Technical University. The authors declare no competing interests. A supplementary file gives the hand-written rule base, the extraction constants and the proposer prompt.</w:t>
+        <w:t xml:space="preserve">The manuscript is original, has not been published previously, and is not under consideration elsewhere. All authors have read and approved the submitted version. Part of the material derives from the doctoral research of the corresponding author at Middle East Technical University. The authors declare no competing interests. A supplementary file gives the hand-written rule base, the extraction constants, the simulation core maps and constants, the search budget and timing harness, and the proposer prompt. Code, configurations, world seeds and admission logs are available at https://github.com/northwind13/GODA, and the dissertation on which the work builds is cited in the manuscript.</w:t>
       </w:r>
     </w:p>
     <w:p>

</xml_diff>

<commit_message>
Reviewer round 3 text: term insertion and partition of unity, no-harm versus operational safety, coating price note, hindcast scope, two claims and bounded open space, LLM call statistics, information asymmetry note; supplement: term insertion, search flow, Table S4 information access, Table S5 components; cover letter one page
Co-Authored-By: Claude Fable 5.1 <noreply@anthropic.com>
Claude-Session: https://claude.ai/code/session_01SpJY1eTMuWxnLRbAr2HJ4M
</commit_message>
<xml_diff>
--- a/02_Article/ieee_systems/DisasterAware_CoverLetter.docx
+++ b/02_Article/ieee_systems/DisasterAware_CoverLetter.docx
@@ -84,7 +84,7 @@
         <w:rPr>
           <w:lang w:val="en-US"/>
         </w:rPr>
-        <w:t xml:space="preserve">Most decision support systems decide within a closed decision space, a set of rules or tactics fixed before the incident. The manuscript presents the Gated Open Decision Architecture (GODA), which extends this space by gated composition. New interventions are composed from a fixed set of executable physical effects, and a proposal enters the rule base only when the hazard model, not the proposer, forecasts a gain. A simulation core holds the hazard state, and a decision core reads it through confidence-rated observations. The decision core combines a self-tuning Takagi-Sugeno rule base with an open layer in which a pretrained language model proposes rules and composed interventions, and a chain of gates on hazard forecasts admits at most one object per call.</w:t>
+        <w:t xml:space="preserve">Most decision support systems decide within a closed decision space, a set of rules or tactics fixed before the incident. The manuscript presents the Gated Open Decision Architecture (GODA), which extends this space by gated composition: new interventions are composed from a fixed set of executable physical effects, and a proposal enters the rule base only when the hazard model, not the proposer, forecasts a gain. A self-tuning Takagi-Sugeno rule base forms the closed layer; in the open layer a pretrained language model proposes rules and composed interventions, and a chain of gates on shadow forecasts admits at most one object per call.</w:t>
       </w:r>
     </w:p>
     <w:p>
@@ -99,7 +99,7 @@
         <w:rPr>
           <w:lang w:val="en-US"/>
         </w:rPr>
-        <w:t xml:space="preserve">On 150 paired synthetic incidents, GODA lowers burned area by 61%, affected population by 80% and response cost by 46% against the closed layer, and raises the share of extinguished incidents from 52% to 91%; on a domain three times larger the area reduction is 57%. Behind the same gates, a search over the closed vocabulary reaches two thirds of this gain and a random proposer over the composed grammar three quarters, while a hand-written doctrine over the same effects gains little, so the gain rests first on the forecast-guided search and then on the compositions it finds from good seeds. The admitted interventions recur across incidents and, recorded as rules, transfer to unseen ones, while continued generation adds further gain under new conditions. The gain holds under single and combined model errors in the live world, under a fire state partly unseen by the planner, under four alternative cost functions, one of them rerun live, and across forecast budgets of 6 to 36 forecasts, where the margin of the model candidates opens at the full budget, and every row of the comparison tables carries a paired test with a Holm adjustment. The hazard model is assessed separately by hindcast of four documented fires against disk and ellipse references, and the decision core decides in under one second between model calls in a harness without the model, with a cost that grows slowly with the number of regional agents.</w:t>
+        <w:t xml:space="preserve">On 150 paired synthetic incidents, GODA lowers burned area by 61% and affected population by 80% against the closed layer, and raises extinguished incidents from 52% to 91%; on a domain three times larger the area reduction is 57%. Three controls locate the gain: a forecast-guided search over the closed vocabulary recovers two thirds of it, a random proposer over the composed grammar three quarters, and a hand-written doctrine over the same effects gains little, so the gain rests on the gated search over the effect grammar more than on the proposer. The admitted interventions, recorded as rules, keep most of the gain on held-out worlds. The gain holds under single and combined model errors, a fire state partly unseen by the planner and alternative cost functions, and every table row carries a paired test with a Holm adjustment. The hazard model is assessed separately by hindcast of four recorded fires.</w:t>
       </w:r>
     </w:p>
     <w:p>
@@ -114,7 +114,7 @@
         <w:rPr>
           <w:lang w:val="en-US"/>
         </w:rPr>
-        <w:t xml:space="preserve">The work fits the scope of the IEEE Systems Journal as a systems-level decision architecture evaluated as one system. Wildfire response joins a hazard model, regional decision agents, a shared resource pool and a human operator. The manuscript contributes the architecture that couples these parts and keeps the admission of new interventions under the control of the hazard model, and evaluates it in simulation as one system rather than as isolated algorithms; distributed operation of the agents is outside the scope of this study.</w:t>
+        <w:t xml:space="preserve">The work fits the scope of the IEEE Systems Journal as a decision architecture that couples a hazard model, regional decision agents, a shared resource pool and an operator, evaluated in simulation as one system; distributed operation is outside the scope of this study.</w:t>
       </w:r>
     </w:p>
     <w:p>
@@ -129,7 +129,7 @@
         <w:rPr>
           <w:lang w:val="en-US"/>
         </w:rPr>
-        <w:t xml:space="preserve">The manuscript is original, has not been published previously, and is not under consideration elsewhere. All authors have read and approved the submitted version. Part of the material derives from the doctoral research of the corresponding author at Middle East Technical University. The authors declare no competing interests. A supplementary file gives the hand-written rule base, the extraction constants, the simulation core maps and constants, the search budget and timing harness, and the proposer prompt. Code, configurations, world seeds and admission logs are available at https://github.com/northwind13/GODA, and the dissertation on which the work builds is cited in the manuscript.</w:t>
+        <w:t xml:space="preserve">The manuscript is original, has not been published previously and is not under consideration elsewhere. Both authors approved the submitted version and declare no competing interests. Part of the material derives from the doctoral research of the corresponding author at Middle East Technical University. A supplementary file gives the rule base, the constants of the simulation core and the search, and the proposer prompt; code, worlds and logs are available at https://github.com/northwind13/GODA.</w:t>
       </w:r>
     </w:p>
     <w:p>

</xml_diff>

<commit_message>
References cut to 46 (15 removed, text adjusted, citations as fields, bibliography renumbered); Table V reference row Evo-fam and lower block moved after cost rows; effect amounts as vartheta_c; VI sentence split; independent futures wording; concept nodes c-hat; Fig. 7 drawing removed from the article; cover letter rewritten around the compositional claim with the Evo-fam reference
Co-Authored-By: Claude Fable 5.1 <noreply@anthropic.com>
Claude-Session: https://claude.ai/code/session_01SpJY1eTMuWxnLRbAr2HJ4M
</commit_message>
<xml_diff>
--- a/02_Article/ieee_systems/DisasterAware_CoverLetter.docx
+++ b/02_Article/ieee_systems/DisasterAware_CoverLetter.docx
@@ -84,7 +84,7 @@
         <w:rPr>
           <w:lang w:val="en-US"/>
         </w:rPr>
-        <w:t xml:space="preserve">Most decision support systems decide within a closed decision space, a set of rules or tactics fixed before the incident. The manuscript presents the Gated Open Decision Architecture (GODA), which extends this space by gated composition: new interventions are composed from a fixed set of executable physical effects, and a proposal enters the rule base only when the hazard model, not the proposer, forecasts a gain. A self-tuning Takagi-Sugeno rule base forms the closed layer; in the open layer a pretrained language model proposes rules and composed interventions, and a chain of gates on shadow forecasts admits at most one object per call.</w:t>
+        <w:t xml:space="preserve">Most decision support systems decide within a closed decision space, a set of rules or tactics fixed before the incident. The manuscript presents the Gated Open Decision Architecture (GODA), built around a forecast-guided search: an executable grammar composes new interventions from a fixed set of physical effects, so the space is bounded and compositional; a chain of gates admits a candidate only when the hazard model, not the proposer, forecasts a gain; and a doctrine record keeps every admitted object in force as a rule. A self-tuning Takagi-Sugeno rule base forms the closed layer; in the open layer a pretrained language model proposes candidates, but any proposer returning the same structured objects can be used.</w:t>
       </w:r>
     </w:p>
     <w:p>
@@ -99,7 +99,7 @@
         <w:rPr>
           <w:lang w:val="en-US"/>
         </w:rPr>
-        <w:t xml:space="preserve">On 150 paired synthetic incidents, GODA lowers burned area by 61% and affected population by 80% against the closed layer, and raises extinguished incidents from 52% to 91%; on a domain three times larger the area reduction is 57%. Three controls locate the gain: a forecast-guided search over the closed vocabulary recovers two thirds of it, a random proposer over the composed grammar three quarters, and a hand-written doctrine over the same effects gains little, so the gain rests on the gated search over the effect grammar more than on the proposer. The same search with every admitted object withdrawn after one cycle loses the gain entirely, so the objects must stay in force through the incident. The admitted interventions, recorded as rules, keep most of the gain on held-out worlds. The gain holds under single and combined model errors, a fire state partly unseen by the planner and alternative cost functions, and every comparison row of the robustness and doctrine tables carries a paired test with a Holm adjustment. The hazard model is assessed separately by hindcast of four recorded fires.</w:t>
+        <w:t xml:space="preserve">On 150 paired synthetic incidents, GODA lowers burned area by 61% against the closed layer and raises extinguished incidents from 52% to 91%; under three model errors combined the reduction is 30%, and it holds on a domain three times larger. Equal-budget controls locate the gain. The strongest optimizer over the closed vocabulary, an evolutionary search over the six intervention families, recovers 70% of it, and GODA lowers burned area by a further 32 ± 16% against that reference (p &lt; 0.0001 after a Holm adjustment over 57 comparisons); a random proposer over the composed grammar recovers three quarters; a hand-written doctrine over the same effects, as written or tuned on forecasts, gains little; and withdrawing every admitted object after one cycle removes the gain entirely. The gain therefore rests on the gated search over the effect grammar and on admitted objects that stay in force through the incident, not on the proposer. Recorded as rules, the admitted interventions keep most of the gain on held-out worlds and scenario families. The hazard model is assessed separately by hindcast of four recorded fires; the effect operators are modelling assumptions bounded by sensitivity tests, including a sweep of the coating effectiveness, and are not calibrated on operations.</w:t>
       </w:r>
     </w:p>
     <w:p>

</xml_diff>